<commit_message>
Mi parte de lsprint
</commit_message>
<xml_diff>
--- a/Sprints.docx
+++ b/Sprints.docx
@@ -37,43 +37,7 @@
           <w:sz w:val="24"/>
           <w:szCs w:val="24"/>
         </w:rPr>
-        <w:t xml:space="preserve">Crear el </w:t>
-      </w:r>
-      <w:proofErr w:type="spellStart"/>
-      <w:r>
-        <w:rPr>
-          <w:rFonts w:ascii="Times New Roman" w:hAnsi="Times New Roman" w:cs="Times New Roman"/>
-          <w:sz w:val="24"/>
-          <w:szCs w:val="24"/>
-        </w:rPr>
-        <w:t>elevator</w:t>
-      </w:r>
-      <w:proofErr w:type="spellEnd"/>
-      <w:r>
-        <w:rPr>
-          <w:rFonts w:ascii="Times New Roman" w:hAnsi="Times New Roman" w:cs="Times New Roman"/>
-          <w:sz w:val="24"/>
-          <w:szCs w:val="24"/>
-        </w:rPr>
-        <w:t xml:space="preserve"> pitch final y diseñar el póster-resumen para presentar el proyecto a </w:t>
-      </w:r>
-      <w:proofErr w:type="spellStart"/>
-      <w:r>
-        <w:rPr>
-          <w:rFonts w:ascii="Times New Roman" w:hAnsi="Times New Roman" w:cs="Times New Roman"/>
-          <w:sz w:val="24"/>
-          <w:szCs w:val="24"/>
-        </w:rPr>
-        <w:t>stakeholders</w:t>
-      </w:r>
-      <w:proofErr w:type="spellEnd"/>
-      <w:r>
-        <w:rPr>
-          <w:rFonts w:ascii="Times New Roman" w:hAnsi="Times New Roman" w:cs="Times New Roman"/>
-          <w:sz w:val="24"/>
-          <w:szCs w:val="24"/>
-        </w:rPr>
-        <w:t xml:space="preserve"> (ficticio), incluyendo motivación, objetivos y entregables principales.</w:t>
+        <w:t>Crear el elevator pitch final y diseñar el póster-resumen para presentar el proyecto a stakeholders (ficticio), incluyendo motivación, objetivos y entregables principales.</w:t>
       </w:r>
     </w:p>
     <w:p>
@@ -136,25 +100,7 @@
           <w:sz w:val="24"/>
           <w:szCs w:val="24"/>
         </w:rPr>
-        <w:t xml:space="preserve">Identificar </w:t>
-      </w:r>
-      <w:proofErr w:type="spellStart"/>
-      <w:r>
-        <w:rPr>
-          <w:rFonts w:ascii="Times New Roman" w:hAnsi="Times New Roman" w:cs="Times New Roman"/>
-          <w:sz w:val="24"/>
-          <w:szCs w:val="24"/>
-        </w:rPr>
-        <w:t>stakeholders</w:t>
-      </w:r>
-      <w:proofErr w:type="spellEnd"/>
-      <w:r>
-        <w:rPr>
-          <w:rFonts w:ascii="Times New Roman" w:hAnsi="Times New Roman" w:cs="Times New Roman"/>
-          <w:sz w:val="24"/>
-          <w:szCs w:val="24"/>
-        </w:rPr>
-        <w:t xml:space="preserve"> clave y para </w:t>
+        <w:t xml:space="preserve">Identificar stakeholders clave y para </w:t>
       </w:r>
       <w:r>
         <w:rPr>
@@ -493,27 +439,7 @@
           <w:szCs w:val="24"/>
           <w:lang w:val="es-AR"/>
         </w:rPr>
-        <w:t xml:space="preserve">Integración en el </w:t>
-      </w:r>
-      <w:proofErr w:type="spellStart"/>
-      <w:r>
-        <w:rPr>
-          <w:rFonts w:ascii="Times New Roman" w:eastAsia="Times New Roman" w:hAnsi="Times New Roman" w:cs="Times New Roman"/>
-          <w:sz w:val="24"/>
-          <w:szCs w:val="24"/>
-          <w:lang w:val="es-AR"/>
-        </w:rPr>
-        <w:t>main</w:t>
-      </w:r>
-      <w:proofErr w:type="spellEnd"/>
-      <w:r>
-        <w:rPr>
-          <w:rFonts w:ascii="Times New Roman" w:eastAsia="Times New Roman" w:hAnsi="Times New Roman" w:cs="Times New Roman"/>
-          <w:sz w:val="24"/>
-          <w:szCs w:val="24"/>
-          <w:lang w:val="es-AR"/>
-        </w:rPr>
-        <w:t>: la descarga de datos poblacionales falla al unificarse con el resto del código.</w:t>
+        <w:t>Integración en el main: la descarga de datos poblacionales falla al unificarse con el resto del código.</w:t>
       </w:r>
     </w:p>
     <w:p>
@@ -563,7 +489,6 @@
         </w:rPr>
         <w:t xml:space="preserve">Implementación de control de excepciones para manejar </w:t>
       </w:r>
-      <w:proofErr w:type="spellStart"/>
       <w:r>
         <w:rPr>
           <w:rFonts w:ascii="Times New Roman" w:eastAsia="Times New Roman" w:hAnsi="Times New Roman" w:cs="Times New Roman"/>
@@ -575,7 +500,6 @@
         </w:rPr>
         <w:t>timeouts</w:t>
       </w:r>
-      <w:proofErr w:type="spellEnd"/>
       <w:r>
         <w:rPr>
           <w:rFonts w:ascii="Times New Roman" w:eastAsia="Times New Roman" w:hAnsi="Times New Roman" w:cs="Times New Roman"/>
@@ -676,7 +600,6 @@
         </w:rPr>
         <w:t xml:space="preserve"> – </w:t>
       </w:r>
-      <w:proofErr w:type="spellStart"/>
       <w:r>
         <w:rPr>
           <w:rFonts w:ascii="Times New Roman" w:eastAsia="Times New Roman" w:hAnsi="Times New Roman" w:cs="Times New Roman"/>
@@ -686,19 +609,7 @@
           <w:szCs w:val="24"/>
           <w:lang w:val="en-US"/>
         </w:rPr>
-        <w:t>Responsable</w:t>
-      </w:r>
-      <w:proofErr w:type="spellEnd"/>
-      <w:r>
-        <w:rPr>
-          <w:rFonts w:ascii="Times New Roman" w:eastAsia="Times New Roman" w:hAnsi="Times New Roman" w:cs="Times New Roman"/>
-          <w:i/>
-          <w:iCs/>
-          <w:sz w:val="24"/>
-          <w:szCs w:val="24"/>
-          <w:lang w:val="en-US"/>
-        </w:rPr>
-        <w:t xml:space="preserve">: </w:t>
+        <w:t xml:space="preserve">Responsable: </w:t>
       </w:r>
       <w:r>
         <w:rPr>
@@ -764,21 +675,8 @@
           <w:szCs w:val="24"/>
           <w:lang w:val="es-AR"/>
         </w:rPr>
-        <w:t xml:space="preserve">Imágenes Satelitales – </w:t>
-      </w:r>
-      <w:proofErr w:type="spellStart"/>
-      <w:r>
-        <w:rPr>
-          <w:rFonts w:ascii="Times New Roman" w:eastAsia="Times New Roman" w:hAnsi="Times New Roman" w:cs="Times New Roman"/>
-          <w:b/>
-          <w:bCs/>
-          <w:sz w:val="24"/>
-          <w:szCs w:val="24"/>
-          <w:lang w:val="es-AR"/>
-        </w:rPr>
-        <w:t>Copernicus</w:t>
-      </w:r>
-      <w:proofErr w:type="spellEnd"/>
+        <w:t>Imágenes Satelitales – Copernicus</w:t>
+      </w:r>
       <w:r>
         <w:rPr>
           <w:rFonts w:ascii="Times New Roman" w:eastAsia="Times New Roman" w:hAnsi="Times New Roman" w:cs="Times New Roman"/>
@@ -799,7 +697,6 @@
         </w:rPr>
         <w:t xml:space="preserve">Responsable: </w:t>
       </w:r>
-      <w:proofErr w:type="spellStart"/>
       <w:r>
         <w:rPr>
           <w:rFonts w:ascii="Times New Roman" w:eastAsia="Times New Roman" w:hAnsi="Times New Roman" w:cs="Times New Roman"/>
@@ -812,7 +709,6 @@
         </w:rPr>
         <w:t>Wen</w:t>
       </w:r>
-      <w:proofErr w:type="spellEnd"/>
     </w:p>
     <w:p>
       <w:pPr>
@@ -1059,25 +955,7 @@
           <w:sz w:val="24"/>
           <w:szCs w:val="24"/>
         </w:rPr>
-        <w:t xml:space="preserve">Encontrar utilidad y forma de interpretación de los datos satelitales de </w:t>
-      </w:r>
-      <w:proofErr w:type="spellStart"/>
-      <w:r>
-        <w:rPr>
-          <w:rFonts w:ascii="Times New Roman" w:eastAsia="Times New Roman" w:hAnsi="Times New Roman" w:cs="Times New Roman"/>
-          <w:sz w:val="24"/>
-          <w:szCs w:val="24"/>
-        </w:rPr>
-        <w:t>Copernicus</w:t>
-      </w:r>
-      <w:proofErr w:type="spellEnd"/>
-      <w:r>
-        <w:rPr>
-          <w:rFonts w:ascii="Times New Roman" w:eastAsia="Times New Roman" w:hAnsi="Times New Roman" w:cs="Times New Roman"/>
-          <w:sz w:val="24"/>
-          <w:szCs w:val="24"/>
-        </w:rPr>
-        <w:t>.</w:t>
+        <w:t>Encontrar utilidad y forma de interpretación de los datos satelitales de Copernicus.</w:t>
       </w:r>
     </w:p>
     <w:p>
@@ -1228,25 +1106,14 @@
           <w:lang w:val="es-AR"/>
         </w:rPr>
       </w:pPr>
-      <w:proofErr w:type="gramStart"/>
-      <w:r>
-        <w:rPr>
-          <w:rFonts w:ascii="Times New Roman" w:eastAsia="Times New Roman" w:hAnsi="Times New Roman" w:cs="Times New Roman"/>
-          <w:sz w:val="24"/>
-          <w:szCs w:val="24"/>
-          <w:lang w:val="es-AR"/>
-        </w:rPr>
-        <w:t>Asegurar</w:t>
-      </w:r>
-      <w:proofErr w:type="gramEnd"/>
-      <w:r>
-        <w:rPr>
-          <w:rFonts w:ascii="Times New Roman" w:eastAsia="Times New Roman" w:hAnsi="Times New Roman" w:cs="Times New Roman"/>
-          <w:sz w:val="24"/>
-          <w:szCs w:val="24"/>
-          <w:lang w:val="es-AR"/>
-        </w:rPr>
-        <w:t xml:space="preserve"> que las nuevas descargas no sobrescriban información anterior y que los datos históricos sean fácilmente accesibles.</w:t>
+      <w:r>
+        <w:rPr>
+          <w:rFonts w:ascii="Times New Roman" w:eastAsia="Times New Roman" w:hAnsi="Times New Roman" w:cs="Times New Roman"/>
+          <w:sz w:val="24"/>
+          <w:szCs w:val="24"/>
+          <w:lang w:val="es-AR"/>
+        </w:rPr>
+        <w:t>Asegurar que las nuevas descargas no sobrescriban información anterior y que los datos históricos sean fácilmente accesibles.</w:t>
       </w:r>
     </w:p>
     <w:p>
@@ -1533,21 +1400,8 @@
           <w:szCs w:val="24"/>
           <w:lang w:val="es-AR"/>
         </w:rPr>
-        <w:t xml:space="preserve">Imágenes Satelitales – </w:t>
-      </w:r>
-      <w:proofErr w:type="spellStart"/>
-      <w:r>
-        <w:rPr>
-          <w:rFonts w:ascii="Times New Roman" w:eastAsia="Times New Roman" w:hAnsi="Times New Roman" w:cs="Times New Roman"/>
-          <w:b/>
-          <w:bCs/>
-          <w:sz w:val="24"/>
-          <w:szCs w:val="24"/>
-          <w:lang w:val="es-AR"/>
-        </w:rPr>
-        <w:t>Copernicus</w:t>
-      </w:r>
-      <w:proofErr w:type="spellEnd"/>
+        <w:t>Imágenes Satelitales – Copernicus</w:t>
+      </w:r>
       <w:r>
         <w:rPr>
           <w:rFonts w:ascii="Times New Roman" w:eastAsia="Times New Roman" w:hAnsi="Times New Roman" w:cs="Times New Roman"/>
@@ -1566,7 +1420,6 @@
         </w:rPr>
         <w:t>(</w:t>
       </w:r>
-      <w:proofErr w:type="spellStart"/>
       <w:r>
         <w:rPr>
           <w:rFonts w:ascii="Times New Roman" w:eastAsia="Times New Roman" w:hAnsi="Times New Roman" w:cs="Times New Roman"/>
@@ -1579,7 +1432,6 @@
         </w:rPr>
         <w:t>Wen</w:t>
       </w:r>
-      <w:proofErr w:type="spellEnd"/>
       <w:r>
         <w:rPr>
           <w:rFonts w:ascii="Times New Roman" w:eastAsia="Times New Roman" w:hAnsi="Times New Roman" w:cs="Times New Roman"/>
@@ -1737,31 +1589,7 @@
           <w:szCs w:val="24"/>
           <w:lang w:val="es-AR"/>
         </w:rPr>
-        <w:t xml:space="preserve">Investigar y Descargar </w:t>
-      </w:r>
-      <w:proofErr w:type="spellStart"/>
-      <w:r>
-        <w:rPr>
-          <w:rFonts w:ascii="Times New Roman" w:eastAsia="Times New Roman" w:hAnsi="Times New Roman" w:cs="Times New Roman"/>
-          <w:b/>
-          <w:bCs/>
-          <w:sz w:val="24"/>
-          <w:szCs w:val="24"/>
-          <w:lang w:val="es-AR"/>
-        </w:rPr>
-        <w:t>mas</w:t>
-      </w:r>
-      <w:proofErr w:type="spellEnd"/>
-      <w:r>
-        <w:rPr>
-          <w:rFonts w:ascii="Times New Roman" w:eastAsia="Times New Roman" w:hAnsi="Times New Roman" w:cs="Times New Roman"/>
-          <w:b/>
-          <w:bCs/>
-          <w:sz w:val="24"/>
-          <w:szCs w:val="24"/>
-          <w:lang w:val="es-AR"/>
-        </w:rPr>
-        <w:t xml:space="preserve"> datos (O relacionarlos)</w:t>
+        <w:t>Investigar y Descargar mas datos (O relacionarlos)</w:t>
       </w:r>
       <w:r>
         <w:rPr>
@@ -1778,35 +1606,75 @@
       <w:r>
         <w:rPr>
           <w:rStyle w:val="Refdecomentario"/>
+          <w:rFonts w:ascii="Times New Roman" w:eastAsia="Times New Roman" w:hAnsi="Times New Roman" w:cs="Times New Roman"/>
+          <w:b/>
+          <w:bCs/>
+          <w:sz w:val="24"/>
+          <w:szCs w:val="24"/>
+          <w:lang w:val="es-AR"/>
+        </w:rPr>
+        <w:commentReference w:id="0"/>
+      </w:r>
+      <w:commentRangeEnd w:id="1"/>
+      <w:r>
+        <w:rPr>
+          <w:rStyle w:val="Refdecomentario"/>
+          <w:rFonts w:ascii="Times New Roman" w:eastAsia="Times New Roman" w:hAnsi="Times New Roman" w:cs="Times New Roman"/>
+          <w:b/>
+          <w:bCs/>
+          <w:sz w:val="24"/>
+          <w:szCs w:val="24"/>
+          <w:lang w:val="es-AR"/>
+        </w:rPr>
+        <w:commentReference w:id="1"/>
+      </w:r>
+      <w:commentRangeEnd w:id="2"/>
+      <w:r>
+        <w:rPr>
+          <w:rStyle w:val="Refdecomentario"/>
+          <w:rFonts w:ascii="Times New Roman" w:eastAsia="Times New Roman" w:hAnsi="Times New Roman" w:cs="Times New Roman"/>
+          <w:b/>
+          <w:bCs/>
+          <w:sz w:val="24"/>
+          <w:szCs w:val="24"/>
+          <w:lang w:val="es-AR"/>
+        </w:rPr>
+        <w:commentReference w:id="2"/>
+      </w:r>
+      <w:r>
+        <w:rPr>
+          <w:rFonts w:ascii="Times New Roman" w:eastAsia="Times New Roman" w:hAnsi="Times New Roman" w:cs="Times New Roman"/>
+          <w:b/>
+          <w:bCs/>
+          <w:sz w:val="24"/>
+          <w:szCs w:val="24"/>
+          <w:lang w:val="es-AR"/>
+        </w:rPr>
+        <w:t xml:space="preserve">  </w:t>
+      </w:r>
+      <w:r>
+        <w:rPr>
+          <w:rFonts w:ascii="Times New Roman" w:eastAsia="Times New Roman" w:hAnsi="Times New Roman" w:cs="Times New Roman"/>
+          <w:b/>
+          <w:bCs/>
+          <w:sz w:val="24"/>
+          <w:szCs w:val="24"/>
           <w:highlight w:val="yellow"/>
-        </w:rPr>
-        <w:commentReference w:id="0"/>
-      </w:r>
-      <w:commentRangeEnd w:id="1"/>
-      <w:r>
-        <w:rPr>
-          <w:rStyle w:val="Refdecomentario"/>
+          <w:lang w:val="es-AR"/>
+        </w:rPr>
+        <w:t>(</w:t>
+      </w:r>
+      <w:r>
+        <w:rPr>
+          <w:rFonts w:ascii="Times New Roman" w:eastAsia="Times New Roman" w:hAnsi="Times New Roman" w:cs="Times New Roman"/>
+          <w:b/>
+          <w:bCs/>
+          <w:sz w:val="24"/>
+          <w:szCs w:val="24"/>
           <w:highlight w:val="yellow"/>
-        </w:rPr>
-        <w:commentReference w:id="1"/>
-      </w:r>
-      <w:commentRangeEnd w:id="2"/>
-      <w:r>
-        <w:rPr>
-          <w:rStyle w:val="Refdecomentario"/>
-        </w:rPr>
-        <w:commentReference w:id="2"/>
-      </w:r>
-      <w:r>
-        <w:rPr>
-          <w:rFonts w:ascii="Times New Roman" w:eastAsia="Times New Roman" w:hAnsi="Times New Roman" w:cs="Times New Roman"/>
-          <w:b/>
-          <w:bCs/>
-          <w:sz w:val="24"/>
-          <w:szCs w:val="24"/>
-          <w:lang w:val="es-AR"/>
-        </w:rPr>
-        <w:t xml:space="preserve">  </w:t>
+          <w:lang w:val="es-AR"/>
+        </w:rPr>
+        <w:t>Fernando</w:t>
       </w:r>
       <w:r>
         <w:rPr>
@@ -1818,7 +1686,7 @@
           <w:highlight w:val="yellow"/>
           <w:lang w:val="es-AR"/>
         </w:rPr>
-        <w:t>(----):</w:t>
+        <w:t>:</w:t>
       </w:r>
     </w:p>
     <w:p>
@@ -1891,21 +1759,12 @@
         </w:rPr>
         <w:t xml:space="preserve">- </w:t>
       </w:r>
-      <w:proofErr w:type="spellStart"/>
-      <w:r>
-        <w:rPr>
-          <w:rFonts w:ascii="Times New Roman" w:hAnsi="Times New Roman" w:cs="Times New Roman"/>
-          <w:lang w:val="es-AR"/>
-        </w:rPr>
-        <w:t>Dockerizar</w:t>
-      </w:r>
-      <w:proofErr w:type="spellEnd"/>
-      <w:r>
-        <w:rPr>
-          <w:rFonts w:ascii="Times New Roman" w:hAnsi="Times New Roman" w:cs="Times New Roman"/>
-          <w:lang w:val="es-AR"/>
-        </w:rPr>
-        <w:t xml:space="preserve"> las</w:t>
+      <w:r>
+        <w:rPr>
+          <w:rFonts w:ascii="Times New Roman" w:hAnsi="Times New Roman" w:cs="Times New Roman"/>
+          <w:lang w:val="es-AR"/>
+        </w:rPr>
+        <w:t>Dockerizar las</w:t>
       </w:r>
       <w:r>
         <w:rPr>
@@ -1994,7 +1853,6 @@
         </w:rPr>
         <w:t xml:space="preserve">validación del </w:t>
       </w:r>
-      <w:proofErr w:type="spellStart"/>
       <w:r>
         <w:rPr>
           <w:rFonts w:ascii="Times New Roman" w:eastAsia="Times New Roman" w:hAnsi="Times New Roman" w:cs="Times New Roman"/>
@@ -2015,9 +1873,295 @@
           <w:szCs w:val="24"/>
           <w:lang w:val="es-AR"/>
         </w:rPr>
-        <w:t>ain</w:t>
-      </w:r>
-      <w:proofErr w:type="spellEnd"/>
+        <w:t xml:space="preserve">ain </w:t>
+      </w:r>
+      <w:r>
+        <w:rPr>
+          <w:rFonts w:ascii="Times New Roman" w:eastAsia="Times New Roman" w:hAnsi="Times New Roman" w:cs="Times New Roman"/>
+          <w:b/>
+          <w:bCs/>
+          <w:sz w:val="24"/>
+          <w:szCs w:val="24"/>
+          <w:lang w:val="es-AR"/>
+        </w:rPr>
+        <w:t>(Martin)</w:t>
+      </w:r>
+      <w:r>
+        <w:rPr>
+          <w:rFonts w:ascii="Times New Roman" w:eastAsia="Times New Roman" w:hAnsi="Times New Roman" w:cs="Times New Roman"/>
+          <w:b/>
+          <w:bCs/>
+          <w:sz w:val="24"/>
+          <w:szCs w:val="24"/>
+          <w:lang w:val="es-AR"/>
+        </w:rPr>
+        <w:t>:</w:t>
+      </w:r>
+    </w:p>
+    <w:p>
+      <w:pPr>
+        <w:rPr>
+          <w:rFonts w:ascii="Times New Roman" w:eastAsia="Times New Roman" w:hAnsi="Times New Roman" w:cs="Times New Roman"/>
+          <w:sz w:val="24"/>
+          <w:szCs w:val="24"/>
+          <w:lang w:val="es-AR"/>
+        </w:rPr>
+      </w:pPr>
+      <w:r>
+        <w:rPr>
+          <w:rFonts w:ascii="Times New Roman" w:eastAsia="Times New Roman" w:hAnsi="Times New Roman" w:cs="Times New Roman"/>
+          <w:b/>
+          <w:bCs/>
+          <w:sz w:val="24"/>
+          <w:szCs w:val="24"/>
+          <w:lang w:val="es-AR"/>
+        </w:rPr>
+        <w:t xml:space="preserve">- </w:t>
+      </w:r>
+      <w:r>
+        <w:rPr>
+          <w:rFonts w:ascii="Times New Roman" w:eastAsia="Times New Roman" w:hAnsi="Times New Roman" w:cs="Times New Roman"/>
+          <w:sz w:val="24"/>
+          <w:szCs w:val="24"/>
+          <w:lang w:val="es-AR"/>
+        </w:rPr>
+        <w:t>Validar/unir los cambios en el main</w:t>
+      </w:r>
+      <w:r>
+        <w:rPr>
+          <w:rFonts w:ascii="Times New Roman" w:eastAsia="Times New Roman" w:hAnsi="Times New Roman" w:cs="Times New Roman"/>
+          <w:sz w:val="24"/>
+          <w:szCs w:val="24"/>
+          <w:lang w:val="es-AR"/>
+        </w:rPr>
+        <w:t>.</w:t>
+      </w:r>
+    </w:p>
+    <w:p>
+      <w:pPr>
+        <w:rPr>
+          <w:rFonts w:ascii="Times New Roman" w:eastAsia="Times New Roman" w:hAnsi="Times New Roman" w:cs="Times New Roman"/>
+          <w:sz w:val="24"/>
+          <w:szCs w:val="24"/>
+          <w:lang w:val="es-AR"/>
+        </w:rPr>
+      </w:pPr>
+      <w:r>
+        <w:rPr>
+          <w:rFonts w:ascii="Times New Roman" w:eastAsia="Times New Roman" w:hAnsi="Times New Roman" w:cs="Times New Roman"/>
+          <w:sz w:val="24"/>
+          <w:szCs w:val="24"/>
+          <w:lang w:val="es-AR"/>
+        </w:rPr>
+        <w:t xml:space="preserve">- </w:t>
+      </w:r>
+      <w:r>
+        <w:rPr>
+          <w:rFonts w:ascii="Times New Roman" w:eastAsia="Times New Roman" w:hAnsi="Times New Roman" w:cs="Times New Roman"/>
+          <w:sz w:val="24"/>
+          <w:szCs w:val="24"/>
+          <w:lang w:val="es-AR"/>
+        </w:rPr>
+        <w:t>Terminar el main de descarga unido (solo el de datos, no imágenes).</w:t>
+      </w:r>
+    </w:p>
+    <w:p>
+      <w:pPr>
+        <w:rPr>
+          <w:rFonts w:ascii="Times New Roman" w:eastAsia="Times New Roman" w:hAnsi="Times New Roman" w:cs="Times New Roman"/>
+          <w:b/>
+          <w:bCs/>
+          <w:sz w:val="24"/>
+          <w:szCs w:val="24"/>
+          <w:lang w:val="es-AR"/>
+        </w:rPr>
+      </w:pPr>
+      <w:r>
+        <w:rPr>
+          <w:rFonts w:ascii="Times New Roman" w:eastAsia="Times New Roman" w:hAnsi="Times New Roman" w:cs="Times New Roman"/>
+          <w:b/>
+          <w:bCs/>
+          <w:sz w:val="24"/>
+          <w:szCs w:val="24"/>
+          <w:lang w:val="es-AR"/>
+        </w:rPr>
+        <w:t xml:space="preserve">5. </w:t>
+      </w:r>
+      <w:r>
+        <w:rPr>
+          <w:rFonts w:ascii="Times New Roman" w:eastAsia="Times New Roman" w:hAnsi="Times New Roman" w:cs="Times New Roman"/>
+          <w:b/>
+          <w:bCs/>
+          <w:sz w:val="24"/>
+          <w:szCs w:val="24"/>
+          <w:lang w:val="es-AR"/>
+        </w:rPr>
+        <w:t>Creación</w:t>
+      </w:r>
+      <w:r>
+        <w:rPr>
+          <w:rFonts w:ascii="Times New Roman" w:eastAsia="Times New Roman" w:hAnsi="Times New Roman" w:cs="Times New Roman"/>
+          <w:b/>
+          <w:bCs/>
+          <w:sz w:val="24"/>
+          <w:szCs w:val="24"/>
+          <w:lang w:val="es-AR"/>
+        </w:rPr>
+        <w:t xml:space="preserve"> de la base de datos (Martin):</w:t>
+      </w:r>
+    </w:p>
+    <w:p>
+      <w:pPr>
+        <w:rPr>
+          <w:rFonts w:ascii="Times New Roman" w:eastAsia="Times New Roman" w:hAnsi="Times New Roman" w:cs="Times New Roman"/>
+          <w:sz w:val="24"/>
+          <w:szCs w:val="24"/>
+          <w:lang w:val="es-AR"/>
+        </w:rPr>
+      </w:pPr>
+      <w:r>
+        <w:rPr>
+          <w:rFonts w:ascii="Times New Roman" w:eastAsia="Times New Roman" w:hAnsi="Times New Roman" w:cs="Times New Roman"/>
+          <w:b/>
+          <w:bCs/>
+          <w:sz w:val="24"/>
+          <w:szCs w:val="24"/>
+          <w:lang w:val="es-AR"/>
+        </w:rPr>
+        <w:t xml:space="preserve">- </w:t>
+      </w:r>
+      <w:r>
+        <w:rPr>
+          <w:rFonts w:ascii="Times New Roman" w:eastAsia="Times New Roman" w:hAnsi="Times New Roman" w:cs="Times New Roman"/>
+          <w:sz w:val="24"/>
+          <w:szCs w:val="24"/>
+          <w:lang w:val="es-AR"/>
+        </w:rPr>
+        <w:t>Creación</w:t>
+      </w:r>
+      <w:r>
+        <w:rPr>
+          <w:rFonts w:ascii="Times New Roman" w:eastAsia="Times New Roman" w:hAnsi="Times New Roman" w:cs="Times New Roman"/>
+          <w:sz w:val="24"/>
+          <w:szCs w:val="24"/>
+          <w:lang w:val="es-AR"/>
+        </w:rPr>
+        <w:t xml:space="preserve"> del diseño de la base de datos.</w:t>
+      </w:r>
+    </w:p>
+    <w:p>
+      <w:pPr>
+        <w:rPr>
+          <w:rFonts w:ascii="Times New Roman" w:eastAsia="Times New Roman" w:hAnsi="Times New Roman" w:cs="Times New Roman"/>
+          <w:sz w:val="24"/>
+          <w:szCs w:val="24"/>
+          <w:lang w:val="es-AR"/>
+        </w:rPr>
+      </w:pPr>
+      <w:r>
+        <w:rPr>
+          <w:rFonts w:ascii="Times New Roman" w:eastAsia="Times New Roman" w:hAnsi="Times New Roman" w:cs="Times New Roman"/>
+          <w:sz w:val="24"/>
+          <w:szCs w:val="24"/>
+          <w:lang w:val="es-AR"/>
+        </w:rPr>
+        <w:t>- Generar las relaciones entre distintos datasets</w:t>
+      </w:r>
+      <w:r>
+        <w:rPr>
+          <w:rFonts w:ascii="Times New Roman" w:eastAsia="Times New Roman" w:hAnsi="Times New Roman" w:cs="Times New Roman"/>
+          <w:sz w:val="24"/>
+          <w:szCs w:val="24"/>
+          <w:lang w:val="es-AR"/>
+        </w:rPr>
+        <w:t>. Si se puede, unir los datos.</w:t>
+      </w:r>
+    </w:p>
+    <w:p>
+      <w:pPr>
+        <w:rPr>
+          <w:rFonts w:ascii="Times New Roman" w:eastAsia="Times New Roman" w:hAnsi="Times New Roman" w:cs="Times New Roman"/>
+          <w:sz w:val="24"/>
+          <w:szCs w:val="24"/>
+          <w:lang w:val="es-AR"/>
+        </w:rPr>
+      </w:pPr>
+      <w:r>
+        <w:rPr>
+          <w:rFonts w:ascii="Times New Roman" w:eastAsia="Times New Roman" w:hAnsi="Times New Roman" w:cs="Times New Roman"/>
+          <w:sz w:val="24"/>
+          <w:szCs w:val="24"/>
+          <w:lang w:val="es-AR"/>
+        </w:rPr>
+        <w:t>- Relacionarlo con la parte de las descargas</w:t>
+      </w:r>
+    </w:p>
+    <w:p>
+      <w:pPr>
+        <w:rPr>
+          <w:rFonts w:ascii="Times New Roman" w:eastAsia="Times New Roman" w:hAnsi="Times New Roman" w:cs="Times New Roman"/>
+          <w:b/>
+          <w:bCs/>
+          <w:sz w:val="24"/>
+          <w:szCs w:val="24"/>
+          <w:lang w:val="es-AR"/>
+        </w:rPr>
+      </w:pPr>
+      <w:r>
+        <w:rPr>
+          <w:rFonts w:ascii="Times New Roman" w:eastAsia="Times New Roman" w:hAnsi="Times New Roman" w:cs="Times New Roman"/>
+          <w:b/>
+          <w:bCs/>
+          <w:sz w:val="24"/>
+          <w:szCs w:val="24"/>
+          <w:lang w:val="es-AR"/>
+        </w:rPr>
+        <w:t>6</w:t>
+      </w:r>
+      <w:r>
+        <w:rPr>
+          <w:rFonts w:ascii="Times New Roman" w:eastAsia="Times New Roman" w:hAnsi="Times New Roman" w:cs="Times New Roman"/>
+          <w:b/>
+          <w:bCs/>
+          <w:sz w:val="24"/>
+          <w:szCs w:val="24"/>
+          <w:lang w:val="es-AR"/>
+        </w:rPr>
+        <w:t>.</w:t>
+      </w:r>
+      <w:r>
+        <w:rPr>
+          <w:rFonts w:ascii="Times New Roman" w:eastAsia="Times New Roman" w:hAnsi="Times New Roman" w:cs="Times New Roman"/>
+          <w:b/>
+          <w:bCs/>
+          <w:sz w:val="24"/>
+          <w:szCs w:val="24"/>
+          <w:lang w:val="es-AR"/>
+        </w:rPr>
+        <w:t xml:space="preserve"> PARA EL FINAL:</w:t>
+      </w:r>
+      <w:r>
+        <w:rPr>
+          <w:rFonts w:ascii="Times New Roman" w:eastAsia="Times New Roman" w:hAnsi="Times New Roman" w:cs="Times New Roman"/>
+          <w:b/>
+          <w:bCs/>
+          <w:sz w:val="24"/>
+          <w:szCs w:val="24"/>
+          <w:lang w:val="es-AR"/>
+        </w:rPr>
+        <w:t xml:space="preserve"> Mockup de la web/mapa interactivo</w:t>
+      </w:r>
+      <w:r>
+        <w:rPr>
+          <w:rFonts w:ascii="Times New Roman" w:eastAsia="Times New Roman" w:hAnsi="Times New Roman" w:cs="Times New Roman"/>
+          <w:b/>
+          <w:bCs/>
+          <w:sz w:val="24"/>
+          <w:szCs w:val="24"/>
+          <w:lang w:val="es-AR"/>
+        </w:rPr>
+        <w:t>:</w:t>
+      </w:r>
       <w:r>
         <w:rPr>
           <w:rFonts w:ascii="Times New Roman" w:eastAsia="Times New Roman" w:hAnsi="Times New Roman" w:cs="Times New Roman"/>
@@ -2038,336 +2182,7 @@
           <w:szCs w:val="24"/>
           <w:lang w:val="es-AR"/>
         </w:rPr>
-        <w:t>(Martin)</w:t>
-      </w:r>
-      <w:r>
-        <w:rPr>
-          <w:rFonts w:ascii="Times New Roman" w:eastAsia="Times New Roman" w:hAnsi="Times New Roman" w:cs="Times New Roman"/>
-          <w:b/>
-          <w:bCs/>
-          <w:sz w:val="24"/>
-          <w:szCs w:val="24"/>
-          <w:lang w:val="es-AR"/>
-        </w:rPr>
-        <w:t>:</w:t>
-      </w:r>
-    </w:p>
-    <w:p>
-      <w:pPr>
-        <w:rPr>
-          <w:rFonts w:ascii="Times New Roman" w:eastAsia="Times New Roman" w:hAnsi="Times New Roman" w:cs="Times New Roman"/>
-          <w:sz w:val="24"/>
-          <w:szCs w:val="24"/>
-          <w:lang w:val="es-AR"/>
-        </w:rPr>
-      </w:pPr>
-      <w:r>
-        <w:rPr>
-          <w:rFonts w:ascii="Times New Roman" w:eastAsia="Times New Roman" w:hAnsi="Times New Roman" w:cs="Times New Roman"/>
-          <w:b/>
-          <w:bCs/>
-          <w:sz w:val="24"/>
-          <w:szCs w:val="24"/>
-          <w:lang w:val="es-AR"/>
-        </w:rPr>
-        <w:t xml:space="preserve">- </w:t>
-      </w:r>
-      <w:r>
-        <w:rPr>
-          <w:rFonts w:ascii="Times New Roman" w:eastAsia="Times New Roman" w:hAnsi="Times New Roman" w:cs="Times New Roman"/>
-          <w:sz w:val="24"/>
-          <w:szCs w:val="24"/>
-          <w:lang w:val="es-AR"/>
-        </w:rPr>
-        <w:t xml:space="preserve">Validar/unir los cambios en el </w:t>
-      </w:r>
-      <w:proofErr w:type="spellStart"/>
-      <w:r>
-        <w:rPr>
-          <w:rFonts w:ascii="Times New Roman" w:eastAsia="Times New Roman" w:hAnsi="Times New Roman" w:cs="Times New Roman"/>
-          <w:sz w:val="24"/>
-          <w:szCs w:val="24"/>
-          <w:lang w:val="es-AR"/>
-        </w:rPr>
-        <w:t>main</w:t>
-      </w:r>
-      <w:proofErr w:type="spellEnd"/>
-      <w:r>
-        <w:rPr>
-          <w:rFonts w:ascii="Times New Roman" w:eastAsia="Times New Roman" w:hAnsi="Times New Roman" w:cs="Times New Roman"/>
-          <w:sz w:val="24"/>
-          <w:szCs w:val="24"/>
-          <w:lang w:val="es-AR"/>
-        </w:rPr>
-        <w:t>.</w:t>
-      </w:r>
-    </w:p>
-    <w:p>
-      <w:pPr>
-        <w:rPr>
-          <w:rFonts w:ascii="Times New Roman" w:eastAsia="Times New Roman" w:hAnsi="Times New Roman" w:cs="Times New Roman"/>
-          <w:sz w:val="24"/>
-          <w:szCs w:val="24"/>
-          <w:lang w:val="es-AR"/>
-        </w:rPr>
-      </w:pPr>
-      <w:r>
-        <w:rPr>
-          <w:rFonts w:ascii="Times New Roman" w:eastAsia="Times New Roman" w:hAnsi="Times New Roman" w:cs="Times New Roman"/>
-          <w:sz w:val="24"/>
-          <w:szCs w:val="24"/>
-          <w:lang w:val="es-AR"/>
-        </w:rPr>
-        <w:t xml:space="preserve">- </w:t>
-      </w:r>
-      <w:r>
-        <w:rPr>
-          <w:rFonts w:ascii="Times New Roman" w:eastAsia="Times New Roman" w:hAnsi="Times New Roman" w:cs="Times New Roman"/>
-          <w:sz w:val="24"/>
-          <w:szCs w:val="24"/>
-          <w:lang w:val="es-AR"/>
-        </w:rPr>
-        <w:t xml:space="preserve">Terminar el </w:t>
-      </w:r>
-      <w:proofErr w:type="spellStart"/>
-      <w:r>
-        <w:rPr>
-          <w:rFonts w:ascii="Times New Roman" w:eastAsia="Times New Roman" w:hAnsi="Times New Roman" w:cs="Times New Roman"/>
-          <w:sz w:val="24"/>
-          <w:szCs w:val="24"/>
-          <w:lang w:val="es-AR"/>
-        </w:rPr>
-        <w:t>main</w:t>
-      </w:r>
-      <w:proofErr w:type="spellEnd"/>
-      <w:r>
-        <w:rPr>
-          <w:rFonts w:ascii="Times New Roman" w:eastAsia="Times New Roman" w:hAnsi="Times New Roman" w:cs="Times New Roman"/>
-          <w:sz w:val="24"/>
-          <w:szCs w:val="24"/>
-          <w:lang w:val="es-AR"/>
-        </w:rPr>
-        <w:t xml:space="preserve"> de descarga unido (solo el de datos, no imágenes).</w:t>
-      </w:r>
-    </w:p>
-    <w:p>
-      <w:pPr>
-        <w:rPr>
-          <w:rFonts w:ascii="Times New Roman" w:eastAsia="Times New Roman" w:hAnsi="Times New Roman" w:cs="Times New Roman"/>
-          <w:b/>
-          <w:bCs/>
-          <w:sz w:val="24"/>
-          <w:szCs w:val="24"/>
-          <w:lang w:val="es-AR"/>
-        </w:rPr>
-      </w:pPr>
-      <w:r>
-        <w:rPr>
-          <w:rFonts w:ascii="Times New Roman" w:eastAsia="Times New Roman" w:hAnsi="Times New Roman" w:cs="Times New Roman"/>
-          <w:b/>
-          <w:bCs/>
-          <w:sz w:val="24"/>
-          <w:szCs w:val="24"/>
-          <w:lang w:val="es-AR"/>
-        </w:rPr>
-        <w:t xml:space="preserve">5. </w:t>
-      </w:r>
-      <w:r>
-        <w:rPr>
-          <w:rFonts w:ascii="Times New Roman" w:eastAsia="Times New Roman" w:hAnsi="Times New Roman" w:cs="Times New Roman"/>
-          <w:b/>
-          <w:bCs/>
-          <w:sz w:val="24"/>
-          <w:szCs w:val="24"/>
-          <w:lang w:val="es-AR"/>
-        </w:rPr>
-        <w:t>Creación</w:t>
-      </w:r>
-      <w:r>
-        <w:rPr>
-          <w:rFonts w:ascii="Times New Roman" w:eastAsia="Times New Roman" w:hAnsi="Times New Roman" w:cs="Times New Roman"/>
-          <w:b/>
-          <w:bCs/>
-          <w:sz w:val="24"/>
-          <w:szCs w:val="24"/>
-          <w:lang w:val="es-AR"/>
-        </w:rPr>
-        <w:t xml:space="preserve"> de la base de datos (Martin):</w:t>
-      </w:r>
-    </w:p>
-    <w:p>
-      <w:pPr>
-        <w:rPr>
-          <w:rFonts w:ascii="Times New Roman" w:eastAsia="Times New Roman" w:hAnsi="Times New Roman" w:cs="Times New Roman"/>
-          <w:sz w:val="24"/>
-          <w:szCs w:val="24"/>
-          <w:lang w:val="es-AR"/>
-        </w:rPr>
-      </w:pPr>
-      <w:r>
-        <w:rPr>
-          <w:rFonts w:ascii="Times New Roman" w:eastAsia="Times New Roman" w:hAnsi="Times New Roman" w:cs="Times New Roman"/>
-          <w:b/>
-          <w:bCs/>
-          <w:sz w:val="24"/>
-          <w:szCs w:val="24"/>
-          <w:lang w:val="es-AR"/>
-        </w:rPr>
-        <w:t xml:space="preserve">- </w:t>
-      </w:r>
-      <w:r>
-        <w:rPr>
-          <w:rFonts w:ascii="Times New Roman" w:eastAsia="Times New Roman" w:hAnsi="Times New Roman" w:cs="Times New Roman"/>
-          <w:sz w:val="24"/>
-          <w:szCs w:val="24"/>
-          <w:lang w:val="es-AR"/>
-        </w:rPr>
-        <w:t>Creación</w:t>
-      </w:r>
-      <w:r>
-        <w:rPr>
-          <w:rFonts w:ascii="Times New Roman" w:eastAsia="Times New Roman" w:hAnsi="Times New Roman" w:cs="Times New Roman"/>
-          <w:sz w:val="24"/>
-          <w:szCs w:val="24"/>
-          <w:lang w:val="es-AR"/>
-        </w:rPr>
-        <w:t xml:space="preserve"> del diseño de la base de datos.</w:t>
-      </w:r>
-    </w:p>
-    <w:p>
-      <w:pPr>
-        <w:rPr>
-          <w:rFonts w:ascii="Times New Roman" w:eastAsia="Times New Roman" w:hAnsi="Times New Roman" w:cs="Times New Roman"/>
-          <w:sz w:val="24"/>
-          <w:szCs w:val="24"/>
-          <w:lang w:val="es-AR"/>
-        </w:rPr>
-      </w:pPr>
-      <w:r>
-        <w:rPr>
-          <w:rFonts w:ascii="Times New Roman" w:eastAsia="Times New Roman" w:hAnsi="Times New Roman" w:cs="Times New Roman"/>
-          <w:sz w:val="24"/>
-          <w:szCs w:val="24"/>
-          <w:lang w:val="es-AR"/>
-        </w:rPr>
-        <w:t xml:space="preserve">- Generar las relaciones entre distintos </w:t>
-      </w:r>
-      <w:proofErr w:type="spellStart"/>
-      <w:r>
-        <w:rPr>
-          <w:rFonts w:ascii="Times New Roman" w:eastAsia="Times New Roman" w:hAnsi="Times New Roman" w:cs="Times New Roman"/>
-          <w:sz w:val="24"/>
-          <w:szCs w:val="24"/>
-          <w:lang w:val="es-AR"/>
-        </w:rPr>
-        <w:t>datasets</w:t>
-      </w:r>
-      <w:proofErr w:type="spellEnd"/>
-      <w:r>
-        <w:rPr>
-          <w:rFonts w:ascii="Times New Roman" w:eastAsia="Times New Roman" w:hAnsi="Times New Roman" w:cs="Times New Roman"/>
-          <w:sz w:val="24"/>
-          <w:szCs w:val="24"/>
-          <w:lang w:val="es-AR"/>
-        </w:rPr>
-        <w:t>. Si se puede, unir los datos.</w:t>
-      </w:r>
-    </w:p>
-    <w:p>
-      <w:pPr>
-        <w:rPr>
-          <w:rFonts w:ascii="Times New Roman" w:eastAsia="Times New Roman" w:hAnsi="Times New Roman" w:cs="Times New Roman"/>
-          <w:sz w:val="24"/>
-          <w:szCs w:val="24"/>
-          <w:lang w:val="es-AR"/>
-        </w:rPr>
-      </w:pPr>
-      <w:r>
-        <w:rPr>
-          <w:rFonts w:ascii="Times New Roman" w:eastAsia="Times New Roman" w:hAnsi="Times New Roman" w:cs="Times New Roman"/>
-          <w:sz w:val="24"/>
-          <w:szCs w:val="24"/>
-          <w:lang w:val="es-AR"/>
-        </w:rPr>
-        <w:t>- Relacionarlo con la parte de las descargas</w:t>
-      </w:r>
-    </w:p>
-    <w:p>
-      <w:pPr>
-        <w:rPr>
-          <w:rFonts w:ascii="Times New Roman" w:eastAsia="Times New Roman" w:hAnsi="Times New Roman" w:cs="Times New Roman"/>
-          <w:b/>
-          <w:bCs/>
-          <w:sz w:val="24"/>
-          <w:szCs w:val="24"/>
-          <w:lang w:val="es-AR"/>
-        </w:rPr>
-      </w:pPr>
-      <w:r>
-        <w:rPr>
-          <w:rFonts w:ascii="Times New Roman" w:eastAsia="Times New Roman" w:hAnsi="Times New Roman" w:cs="Times New Roman"/>
-          <w:b/>
-          <w:bCs/>
-          <w:sz w:val="24"/>
-          <w:szCs w:val="24"/>
-          <w:lang w:val="es-AR"/>
-        </w:rPr>
-        <w:t>6</w:t>
-      </w:r>
-      <w:r>
-        <w:rPr>
-          <w:rFonts w:ascii="Times New Roman" w:eastAsia="Times New Roman" w:hAnsi="Times New Roman" w:cs="Times New Roman"/>
-          <w:b/>
-          <w:bCs/>
-          <w:sz w:val="24"/>
-          <w:szCs w:val="24"/>
-          <w:lang w:val="es-AR"/>
-        </w:rPr>
-        <w:t>.</w:t>
-      </w:r>
-      <w:r>
-        <w:rPr>
-          <w:rFonts w:ascii="Times New Roman" w:eastAsia="Times New Roman" w:hAnsi="Times New Roman" w:cs="Times New Roman"/>
-          <w:b/>
-          <w:bCs/>
-          <w:sz w:val="24"/>
-          <w:szCs w:val="24"/>
-          <w:lang w:val="es-AR"/>
-        </w:rPr>
-        <w:t xml:space="preserve"> PARA EL FINAL:</w:t>
-      </w:r>
-      <w:r>
-        <w:rPr>
-          <w:rFonts w:ascii="Times New Roman" w:eastAsia="Times New Roman" w:hAnsi="Times New Roman" w:cs="Times New Roman"/>
-          <w:b/>
-          <w:bCs/>
-          <w:sz w:val="24"/>
-          <w:szCs w:val="24"/>
-          <w:lang w:val="es-AR"/>
-        </w:rPr>
-        <w:t xml:space="preserve"> Mockup de la web/mapa interactivo</w:t>
-      </w:r>
-      <w:r>
-        <w:rPr>
-          <w:rFonts w:ascii="Times New Roman" w:eastAsia="Times New Roman" w:hAnsi="Times New Roman" w:cs="Times New Roman"/>
-          <w:b/>
-          <w:bCs/>
-          <w:sz w:val="24"/>
-          <w:szCs w:val="24"/>
-          <w:lang w:val="es-AR"/>
-        </w:rPr>
-        <w:t>:</w:t>
-      </w:r>
-      <w:r>
-        <w:rPr>
-          <w:rFonts w:ascii="Times New Roman" w:eastAsia="Times New Roman" w:hAnsi="Times New Roman" w:cs="Times New Roman"/>
-          <w:b/>
-          <w:bCs/>
-          <w:sz w:val="24"/>
-          <w:szCs w:val="24"/>
-          <w:lang w:val="es-AR"/>
-        </w:rPr>
-        <w:t xml:space="preserve"> </w:t>
+        <w:t>(</w:t>
       </w:r>
       <w:r>
         <w:rPr>
@@ -2379,7 +2194,19 @@
           <w:highlight w:val="yellow"/>
           <w:lang w:val="es-AR"/>
         </w:rPr>
-        <w:t>(---)</w:t>
+        <w:t>fernando</w:t>
+      </w:r>
+      <w:r>
+        <w:rPr>
+          <w:rFonts w:ascii="Times New Roman" w:eastAsia="Times New Roman" w:hAnsi="Times New Roman" w:cs="Times New Roman"/>
+          <w:b/>
+          <w:bCs/>
+          <w:sz w:val="24"/>
+          <w:szCs w:val="24"/>
+          <w:highlight w:val="yellow"/>
+          <w:lang w:val="es-AR"/>
+        </w:rPr>
+        <w:t>)</w:t>
       </w:r>
     </w:p>
     <w:p>
@@ -2489,6 +2316,17 @@
         </w:rPr>
         <w:t>on Lorca</w:t>
       </w:r>
+      <w:r>
+        <w:rPr>
+          <w:rFonts w:ascii="Times New Roman" w:eastAsia="Times New Roman" w:hAnsi="Times New Roman" w:cs="Times New Roman"/>
+          <w:b/>
+          <w:bCs/>
+          <w:sz w:val="24"/>
+          <w:szCs w:val="24"/>
+          <w:lang w:val="es-AR"/>
+        </w:rPr>
+        <w:t>(Fernando(</w:t>
+      </w:r>
     </w:p>
     <w:p>
       <w:pPr>
@@ -2545,19 +2383,8 @@
           <w:szCs w:val="24"/>
           <w:lang w:val="es-AR"/>
         </w:rPr>
-        <w:t xml:space="preserve">/pasar archivos de local a </w:t>
-      </w:r>
-      <w:proofErr w:type="spellStart"/>
-      <w:r>
-        <w:rPr>
-          <w:rFonts w:ascii="Times New Roman" w:eastAsia="Times New Roman" w:hAnsi="Times New Roman" w:cs="Times New Roman"/>
-          <w:sz w:val="24"/>
-          <w:szCs w:val="24"/>
-          <w:lang w:val="es-AR"/>
-        </w:rPr>
-        <w:t>lorca</w:t>
-      </w:r>
-      <w:proofErr w:type="spellEnd"/>
+        <w:t>/pasar archivos de local a lorca</w:t>
+      </w:r>
     </w:p>
     <w:p>
       <w:pPr>
@@ -2627,25 +2454,7 @@
           <w:sz w:val="24"/>
           <w:szCs w:val="24"/>
         </w:rPr>
-        <w:t xml:space="preserve">• Diseñar la estrategia de </w:t>
-      </w:r>
-      <w:proofErr w:type="spellStart"/>
-      <w:r>
-        <w:rPr>
-          <w:rFonts w:ascii="Times New Roman" w:hAnsi="Times New Roman" w:cs="Times New Roman"/>
-          <w:sz w:val="24"/>
-          <w:szCs w:val="24"/>
-        </w:rPr>
-        <w:t>contenerización</w:t>
-      </w:r>
-      <w:proofErr w:type="spellEnd"/>
-      <w:r>
-        <w:rPr>
-          <w:rFonts w:ascii="Times New Roman" w:hAnsi="Times New Roman" w:cs="Times New Roman"/>
-          <w:sz w:val="24"/>
-          <w:szCs w:val="24"/>
-        </w:rPr>
-        <w:t xml:space="preserve"> de los pipelines. </w:t>
+        <w:t xml:space="preserve">• Diseñar la estrategia de contenerización de los pipelines. </w:t>
       </w:r>
     </w:p>
     <w:p>

</xml_diff>